<commit_message>
Ex-tarifário Factiun: contrato e NDA Videl × Planeta Comex, correção no guia SEI e zip do pacote
- docs/ex-tarifario/planeta-comex: minuta de contrato de prestação de serviços (validação, parecer NCM, protocolo) e NDA com a Factiun como terceira beneficiária (md/docx/pdf)
- substancia-checklist: nota (*) da NCM da TCU corrigida
- _build/build_docs.py: opção --keep-html e novos PDFs padrão
- docs/ex-tarifario-factiun-pacote-2026-09-02.zip: pacote completo para envio

Co-Authored-By: Claude Fable 5.1 <noreply@anthropic.com>
Claude-Session: https://claude.ai/code/session_0119XEiSbtmarfLJsk66w7jB
</commit_message>
<xml_diff>
--- a/docs/ex-tarifario/substancia-checklist-protocolo-sei.docx
+++ b/docs/ex-tarifario/substancia-checklist-protocolo-sei.docx
@@ -3275,7 +3275,7 @@
               <w:rPr>
                 <w:sz w:val="18"/>
               </w:rPr>
-              <w:t>8479.90.90*</w:t>
+              <w:t>8479.90.90 (*)</w:t>
             </w:r>
           </w:p>
         </w:tc>
@@ -3354,13 +3354,13 @@
     <w:p/>
     <w:p>
       <w:r>
-        <w:t>\</w:t>
+        <w:t>(</w:t>
       </w:r>
       <w:r>
         <w:rPr>
           <w:i/>
         </w:rPr>
-        <w:t xml:space="preserve"> Salvo parecer de classificação contrário do despachante (alternativa 8517.62.59, BIT, 20%). Seja qual for, </w:t>
+        <w:t xml:space="preserve">) Salvo parecer de classificação contrário do despachante (alternativa 8517.62.59, BIT, 20%). Seja qual for, </w:t>
       </w:r>
       <w:r>
         <w:rPr>

</xml_diff>